<commit_message>
fix(collab): allow duplicate filename suffixes like (1) in getMaterialLinks
</commit_message>
<xml_diff>
--- a/閱讀教學策略查詢系統/docs/2026AI教育研討會投稿草稿.docx
+++ b/閱讀教學策略查詢系統/docs/2026AI教育研討會投稿草稿.docx
@@ -82,7 +82,7 @@
         <w:rPr>
           <w:sz w:val="24"/>
         </w:rPr>
-        <w:t>本系統以「教師教學循環」為設計主軸，整合三個連貫階段：備課查詢、課堂簡報、遷移驗證。教師在備課時可依年級、認知歷程、教學策略三維篩選，快速找到對應的試題案例與具體教學步驟；課堂中切換為簡報模式，文章與題目左右對照直接投影；課後指派遷移文章，由學生完成作答並獲得即時批改，教師同步查看成績看板。</w:t>
+        <w:t>本系統以「教師教學循環」為設計主軸，整合三個連貫階段：備課查詢、課堂簡報、遷移驗證，並已完整部署上線（Google Apps Script Web App，版本 @150）。教師在備課時可依年級、認知歷程、教學策略三維篩選，快速找到對應的試題案例與具體教學步驟，並直接點擊教材 PDF 連結徽章開啟原始教材，或點擊考古題試卷徽章精準跳至試卷對應頁碼；課堂中切換為簡報模式，文章與題目左右對照直接投影，並可一鍵切換至遷移文章進行課中練習；課後學生透過「免登入」自主練習系統即可完成遷移作答，完成後可下載個人成績卡圖檔，教師同步查看成績看板。</w:t>
       </w:r>
     </w:p>
     <w:p>
@@ -116,13 +116,12 @@
           <w:b/>
           <w:sz w:val="24"/>
         </w:rPr>
-        <w:t>第一階段：備課查詢。</w:t>
+        <w:t>第一階段：備課查詢。年級、認知歷程（提取訊息、推論訊息、詮釋整合、比較評估）、文本類型、教學策略四個維度篩選，或直接關鍵字搜尋。每道題目卡片顯示：教學策略名稱、認知歷程層次、學生常見迷思、具體教學步驟、文章全文，並附有兩種快捷徽章——「教材 PDF 徽章」直連 Google Drive 原始教材、「考古題試卷徽章」開啟 GitHub Pages 上的歷年試卷並精準跳至文章所在頁碼（61 篇自動比對成功、9 篇人工驗證補齊）。這個階段解決的是「教師備課找不到系統性資料」的核心痛點。</w:t>
       </w:r>
       <w:r>
         <w:rPr>
           <w:sz w:val="24"/>
         </w:rPr>
-        <w:t>年級、認知歷程（提取訊息、推論訊息、詮釋整合、比較評估）、文本類型、教學策略四個維度篩選，或直接關鍵字搜尋。每道題目卡片顯示：教學策略名稱、認知歷程層次、學生常見迷思、具體教學步驟、文章全文。這個階段解決的是「教師備課找不到系統性資料」的核心痛點。</w:t>
       </w:r>
     </w:p>
     <w:p>
@@ -131,13 +130,12 @@
           <w:b/>
           <w:sz w:val="24"/>
         </w:rPr>
-        <w:t>第二階段：課堂簡報。</w:t>
+        <w:t>第二階段：課堂簡報。畫面分為左右兩側——左側為文章全文（支援 Google Drive 圖文混排嵌入），右側為題目逐題翻頁，並附點數指示器控制教學節奏。教師可即時調整字體大小（50%～200%）與段落切換模式，並可一鍵切換至對應的「遷移文章＋遷移題目」，實現課堂即時遷移練習。這個階段讓教師無需另行製作投影片即可上課。</w:t>
       </w:r>
       <w:r>
         <w:rPr>
           <w:sz w:val="24"/>
         </w:rPr>
-        <w:t>，畫面分為左右兩側——左側為文章全文（比例對應原始試卷版面），右側為題目逐題翻頁，並附點數指示器控制教學節奏。教師可即時調整字體大小與左右比例，系統亦支援圖文混排（如試卷中含圖表的題組）。這個階段讓教師無需另行製作投影片即可上課。</w:t>
       </w:r>
     </w:p>
     <w:p>
@@ -146,13 +144,12 @@
           <w:b/>
           <w:sz w:val="24"/>
         </w:rPr>
-        <w:t>第三階段：概念遷移驗證。</w:t>
+        <w:t>第三階段：概念遷移驗證。系統提供兩種模式：「教師指派模式」由教師從管理頁指派特定文章，學生以座號＋姓名登入後作答，完成後系統即時批改並顯示結果，教師端查看全班成績看板；「免登入自主練習模式」（student_practice）讓學生無需帳號直接依年級選文自主作答，完成後可一鍵產生個人「成績卡圖檔」供繳交留存。教師可掌握哪些學生尚未達到遷移能力。</w:t>
       </w:r>
       <w:r>
         <w:rPr>
           <w:sz w:val="24"/>
         </w:rPr>
-        <w:t>文章，測驗學生能否將剛學的策略應用於陌生材料。學生透過座號登入作答頁，完成後系統即時批改並顯示結果；教師端則可查看全班作答成績看板，掌握哪些學生尚未達到遷移能力。</w:t>
       </w:r>
     </w:p>
     <w:p>
@@ -186,13 +183,12 @@
           <w:b/>
           <w:sz w:val="24"/>
         </w:rPr>
-        <w:t>第一層：原始題庫資料健檢。</w:t>
+        <w:t>第一層：原始題庫資料健檢。 同時閱讀 195 道原始試題與教育部學習扶助國語教材（三至六年級，約 80 份 PDF），交叉比對教師人工標記的「認知歷程」標籤是否與教材對應段落的閱讀要求吻合。健檢結果發現 7 道題目的標籤有誤（例如標記為「提取訊息」但實際解題需要跨段落推論），並生成修正報告，經人工複核後自動寫回 Excel 試算表。同步修正三年級具體教學步驟格式（統一補句號、清除尾部多餘數字，共修正 41 筆）。以官方教材為對照基準，確保後續所有遷移題目是在「符合課綱定義的認知層次」上生成的。</w:t>
       </w:r>
       <w:r>
         <w:rPr>
           <w:sz w:val="24"/>
         </w:rPr>
-        <w:t xml:space="preserve"> 同時閱讀 195 道原始試題與教育部學習扶助國語教材（三至六年級，約 80 份 PDF），交叉比對教師人工標記的「認知歷程」標籤是否與教材對應段落的閱讀要求吻合。健檢結果發現 7 道題目的標籤有誤（例如標記為「提取訊息」但實際解題需要跨段落推論），並生成修正報告，經人工複核後自動寫回 Excel 試算表。以官方教材為對照基準，確保後續所有遷移題目是在「符合課綱定義的認知層次」上生成的。</w:t>
       </w:r>
     </w:p>
     <w:p>
@@ -201,13 +197,12 @@
           <w:b/>
           <w:sz w:val="24"/>
         </w:rPr>
-        <w:t>第二層：遷移題目生成。</w:t>
+        <w:t>第二層：遷移題目生成。 閱讀每道原始試題的文章全文、認知歷程標籤與教學策略後，以文章為單位（1 篇原文配對 3 篇補充文本），自動生成對應的遷移文本與四選項題目，確保遷移題與原題在考點複雜度與誘答設計上具有同構性。本系統已完成生成全部 585 道遷移題目，覆蓋三至六年級全部 19 種教學策略。生成後並以兩輪清洗去除 PDF 掃描引入的頁碼標記（共修正 384 筆），確保遷移文本乾淨無雜訊。</w:t>
       </w:r>
       <w:r>
         <w:rPr>
           <w:sz w:val="24"/>
         </w:rPr>
-        <w:t xml:space="preserve"> 閱讀每道原始試題的文章全文、認知歷程標籤與教學策略後，自動生成對應的遷移文本與四選項題目，確保遷移題與原題在考點複雜度與誘答設計上具有同構性。本系統共生成 585 道遷移題目，覆蓋三至六年級全部 19 種教學策略。</w:t>
       </w:r>
     </w:p>
     <w:p>
@@ -216,13 +211,12 @@
           <w:b/>
           <w:sz w:val="24"/>
         </w:rPr>
-        <w:t>第三層：品質審查。</w:t>
+        <w:t>第三層：品質審查。以 Claude Sonnet 4.6 對每道遷移題進行四維度評分——考點同構（遷移題是否複製原題解題路徑）、誘答一致（錯誤選項是否對應相同類別的學生迷思）、策略適用（學生是否必須運用該策略才能作答）、基礎適配（詞彙難度是否符合學扶學生程度）——並給出「通過 / 需微調 / 建議重作」判定，同步輸出修正版題目與答案依據。整個審查過程全自動寫回試算表。審查完成後，以 Python 腳本分批修補含佔位符（OOO/XXX）的 272 道題目，補齊完整四選一選項。最終 585 題 100% 完成審查，其中 575 題通過（98.3%）、10 題標記需微調、0 題建議重作。</w:t>
       </w:r>
       <w:r>
         <w:rPr>
           <w:sz w:val="24"/>
         </w:rPr>
-        <w:t>Sonnet 4.6 對每道遷移題進行四維度評分——考點同構（遷移題是否複製原題解題路徑）、誘答一致（錯誤選項是否對應相同類別的學生迷思）、策略適用（學生是否必須運用該策略才能作答）、基礎適配（詞彙難度是否符合學扶學生程度）——並給出「通過 / 需微調 / 建議重作」判定，同步輸出修正版題目與答案依據。整個審查過程全自動寫回試算表，教師只需複核有問題的題目。</w:t>
       </w:r>
     </w:p>
     <w:p>
@@ -230,7 +224,7 @@
         <w:rPr>
           <w:sz w:val="24"/>
         </w:rPr>
-        <w:t>三個層次合在一起，AI 承擔了整個題庫從「原料進場→品質把關→規模擴充→再次驗證」的完整 QC 流程。</w:t>
+        <w:t>三個層次合在一起，AI 承擔了整個題庫從「原料進場→健檢校正→遷移生成→規模擴充→多維品管→再次驗證」的完整 QC 流程，全部 585 道遷移題目已 100% 完成，可直接供教師使用。</w:t>
       </w:r>
     </w:p>
     <w:p>
@@ -287,13 +281,12 @@
           <w:b/>
           <w:sz w:val="24"/>
         </w:rPr>
-        <w:t>文章全文補齊率：</w:t>
+        <w:t>文章全文補齊率：透過 AI 輔助 PDF 掃描（pdfplumber），57 篇文章全文完成入庫，完成率 83%（餘 12 篇為圖文／infographic 格式，無純文字可擷取，屬正常限制）。</w:t>
       </w:r>
       <w:r>
         <w:rPr>
           <w:sz w:val="24"/>
         </w:rPr>
-        <w:t>透過 AI 輔助 PDF 掃描，57 篇文章全文完成入庫，完成率 83%。</w:t>
       </w:r>
     </w:p>
     <w:p>
@@ -305,13 +298,12 @@
           <w:b/>
           <w:sz w:val="24"/>
         </w:rPr>
-        <w:t>AI 審查效率：</w:t>
+        <w:t>AI 審查完成率與效率：585 道遷移題目 100% 完成 AI 多維度審查，通過率 98.3%（575 題通過、10 題需微調、0 題建議重作）；每題平均審查時間約 3 秒（含 API 呼叫），人工逐題審閱同等數量預計需 2 至 3 天。</w:t>
       </w:r>
       <w:r>
         <w:rPr>
           <w:sz w:val="24"/>
         </w:rPr>
-        <w:t>每題平均審查時間約 3 秒（含 API 呼叫），人工逐題審閱同等數量預計需 2 至 3 天。</w:t>
       </w:r>
     </w:p>
     <w:p>
@@ -346,7 +338,7 @@
         <w:rPr>
           <w:sz w:val="24"/>
         </w:rPr>
-        <w:t>教材查詢與簡報功能已完整上線，可直接分享網址給任何教師使用，無個人資料疑慮。</w:t>
+        <w:t>備課查詢與課堂簡報功能已完整上線，包含教材 PDF 直連、考古題試卷精準跳頁（GitHub Pages 托管，支援 #page=N&amp;view=FitH 參數），可直接分享網址給任何教師使用，無個人資料疑慮。學生自主練習系統（student_practice）亦已上線，採免登入設計，無帳號管理負擔。</w:t>
       </w:r>
     </w:p>
     <w:p>
@@ -354,7 +346,7 @@
         <w:rPr>
           <w:sz w:val="24"/>
         </w:rPr>
-        <w:t>測驗作答功能目前架構在單一 Google 帳號下，若推廣至多校需重新設計班級隔離機制，適合先以班級或學校內部試行。</w:t>
+        <w:t>測驗指派功能目前架構在單一 Google Sheets 下，若推廣至多校需重新設計班級隔離機制，適合先以班級或學校內部試行；免登入自主練習模式則不受此限制，可直接跨校分享使用。</w:t>
       </w:r>
     </w:p>
     <w:p>
@@ -362,7 +354,7 @@
         <w:rPr>
           <w:sz w:val="24"/>
         </w:rPr>
-        <w:t>建議推廣路徑：第一步分享教材查詢網址給同校或鄰近學校教師試用；第二步待遷移題目審查全數完成後發布完整版題庫；第三步申請學習扶助資源中心掛載或投稿教學卓越獎。</w:t>
+        <w:t>建議推廣路徑：第一步分享教材查詢網址給同校或鄰近學校教師試用（含考古題精準跳頁體驗）；第二步發布完整版遷移題庫（585 道已 100% 完成審查，可立即使用）；第三步申請學習扶助資源中心掛載或投稿教學卓越獎，並開源 Python 題庫建置腳本供他校複製推廣。</w:t>
       </w:r>
     </w:p>
     <w:p>
@@ -419,13 +411,12 @@
           <w:b/>
           <w:sz w:val="24"/>
         </w:rPr>
-        <w:t>AI 工具：</w:t>
+        <w:t>AI 工具：Claude Sonnet 4.6（Anthropic）——題庫健檢、遷移題目生成與品質審查；Claude Code（命令列專案工具）——跨檔案批次讀取與自動化執行</w:t>
       </w:r>
       <w:r>
         <w:rPr>
           <w:sz w:val="24"/>
         </w:rPr>
-        <w:t>Claude Sonnet 4.6（Anthropic）——題庫健檢、遷移題目生成與品質審查</w:t>
       </w:r>
     </w:p>
     <w:p>
@@ -437,13 +428,12 @@
           <w:b/>
           <w:sz w:val="24"/>
         </w:rPr>
-        <w:t>後端技術：</w:t>
+        <w:t>後端技術：Google Apps Script、Google Sheets、GitHub Pages（考古題 PDF 靜態托管）</w:t>
       </w:r>
       <w:r>
         <w:rPr>
           <w:sz w:val="24"/>
         </w:rPr>
-        <w:t>Google Apps Script、Google Sheets</w:t>
       </w:r>
     </w:p>
     <w:p>

</xml_diff>

<commit_message>
fix(collab): fix input column error by using RichTextValue for exam links
</commit_message>
<xml_diff>
--- a/閱讀教學策略查詢系統/docs/2026AI教育研討會投稿草稿.docx
+++ b/閱讀教學策略查詢系統/docs/2026AI教育研討會投稿草稿.docx
@@ -74,7 +74,7 @@
         <w:rPr>
           <w:sz w:val="24"/>
         </w:rPr>
-        <w:t>學習扶助教師普遍面臨三項困境：備課資源零散、教學策略難以轉化為課堂實作、缺乏即時的學習回饋機制。現有教材與試題分散於各部會網站，教師在課前往往耗費大量時間搜集整合，而「讓學生將策略遷移至陌生文本」的練習設計，更幾乎付之闕如。</w:t>
+        <w:t>做學習扶助，最消耗時間的往往不是上課，而是備課。想找一道好的推論題來示範給三年級的孩子看，得在三四個網站之間來回搜尋；好不容易找到試題，又不確定它對應的是哪個認知層次、適合哪種教學策略。更麻煩的是，就算這堂課教得順，課後幾乎沒有現成的題目可以讓學生換篇文章練練看——「遷移」這件事在學習扶助現場幾乎是空白的。這個系統就是從這些麻煩事開始做的。</w:t>
       </w:r>
     </w:p>
     <w:p>
@@ -82,7 +82,7 @@
         <w:rPr>
           <w:sz w:val="24"/>
         </w:rPr>
-        <w:t>本系統以「教師教學循環」為設計主軸，整合三個連貫階段：備課查詢、課堂簡報、遷移驗證，並已完整部署上線（Google Apps Script Web App，版本 @150）。教師在備課時可依年級、認知歷程、教學策略三維篩選，快速找到對應的試題案例與具體教學步驟，並直接點擊教材 PDF 連結徽章開啟原始教材，或點擊考古題試卷徽章精準跳至試卷對應頁碼；課堂中切換為簡報模式，文章與題目左右對照直接投影，並可一鍵切換至遷移文章進行課中練習；課後學生透過「免登入」自主練習系統即可完成遷移作答，完成後可下載個人成績卡圖檔，教師同步查看成績看板。</w:t>
+        <w:t>它把備課、上課、課後驗收三個環節串在一起，讓老師不用在不同地方來回切換。備課時照年級、認知歷程和教學策略篩選，找到想要的題目之後，直接點一下就能開原始教材 PDF，或跳到考古試卷的那一頁；課堂上切換成簡報模式，左邊文章右邊題目，一個畫面直接投影；教完之後想馬上讓學生換篇文章練習，同一頁切換一下就到遷移題了。課後學生用自己的裝置打開練習頁面，不需要帳號，選好年級和文章就可以作答，做完還能下載一張成績圖檔。</w:t>
       </w:r>
     </w:p>
     <w:p>
@@ -90,7 +90,7 @@
         <w:rPr>
           <w:sz w:val="24"/>
         </w:rPr>
-        <w:t>整套系統以 Google Apps Script 為後端、Google Sheets 為資料庫，無需安裝任何軟體，教師透過瀏覽器即可使用。</w:t>
+        <w:t>整套東西架在 Google Apps Script 上，老師和學生用瀏覽器就能開，不需要安裝任何程式。</w:t>
       </w:r>
     </w:p>
     <w:p>
@@ -107,7 +107,7 @@
         <w:rPr>
           <w:sz w:val="24"/>
         </w:rPr>
-        <w:t>本系統由三個功能模組構成一個完整的教學循環。</w:t>
+        <w:t>三個環節各有一個對應的功能模組，連在一起就是一個完整的教學循環。</w:t>
       </w:r>
     </w:p>
     <w:p>
@@ -116,7 +116,7 @@
           <w:b/>
           <w:sz w:val="24"/>
         </w:rPr>
-        <w:t>第一階段：備課查詢。年級、認知歷程（提取訊息、推論訊息、詮釋整合、比較評估）、文本類型、教學策略四個維度篩選，或直接關鍵字搜尋。每道題目卡片顯示：教學策略名稱、認知歷程層次、學生常見迷思、具體教學步驟、文章全文，並附有兩種快捷徽章——「教材 PDF 徽章」直連 Google Drive 原始教材、「考古題試卷徽章」開啟 GitHub Pages 上的歷年試卷並精準跳至文章所在頁碼（61 篇自動比對成功、9 篇人工驗證補齊）。這個階段解決的是「教師備課找不到系統性資料」的核心痛點。</w:t>
+        <w:t>備課查詢：老師可以用年級、認知歷程（提取訊息、推論訊息、詮釋整合、比較評估）、文本類型、教學策略這幾個條件篩選，也可以直接打關鍵字。找到的每張題目卡都有教學策略說明、學生常見迷思和具體教學步驟，旁邊附了兩個小按鈕：一個直連 Google Drive 上的原始教材 PDF，另一個直接打開考古試卷並跳到那篇文章所在的頁碼，不用自己翻。這兩個功能是後來加的，用過之後才發現省了不少時間。</w:t>
       </w:r>
       <w:r>
         <w:rPr>
@@ -130,7 +130,7 @@
           <w:b/>
           <w:sz w:val="24"/>
         </w:rPr>
-        <w:t>第二階段：課堂簡報。畫面分為左右兩側——左側為文章全文（支援 Google Drive 圖文混排嵌入），右側為題目逐題翻頁，並附點數指示器控制教學節奏。教師可即時調整字體大小（50%～200%）與段落切換模式，並可一鍵切換至對應的「遷移文章＋遷移題目」，實現課堂即時遷移練習。這個階段讓教師無需另行製作投影片即可上課。</w:t>
+        <w:t>課堂簡報：畫面分左右兩半，左邊放文章，右邊放題目，老師一題一題翻。字體大小可以從 50% 調到 200%，試卷裡有圖表的題組也支援圖文一起顯示。想讓學生當場試試看換篇文章，同一個頁面切換一下就到遷移題了，不需要另外準備投影片。</w:t>
       </w:r>
       <w:r>
         <w:rPr>
@@ -144,7 +144,7 @@
           <w:b/>
           <w:sz w:val="24"/>
         </w:rPr>
-        <w:t>第三階段：概念遷移驗證。系統提供兩種模式：「教師指派模式」由教師從管理頁指派特定文章，學生以座號＋姓名登入後作答，完成後系統即時批改並顯示結果，教師端查看全班成績看板；「免登入自主練習模式」（student_practice）讓學生無需帳號直接依年級選文自主作答，完成後可一鍵產生個人「成績卡圖檔」供繳交留存。教師可掌握哪些學生尚未達到遷移能力。</w:t>
+        <w:t>遷移驗收有兩種方式。如果老師想統一指派，可以從管理頁面選好文章推送給全班，學生輸入座號和姓名就能作答，做完馬上看到對錯，老師那邊也能看到全班成績一覽。如果只是讓學生自己練，直接分享連結就好——不用帳號，選好年級和文章就能開始，完成後可以下載一張成績圖檔留著。</w:t>
       </w:r>
       <w:r>
         <w:rPr>
@@ -166,7 +166,7 @@
         <w:rPr>
           <w:sz w:val="24"/>
         </w:rPr>
-        <w:t>在本系統中，AI 扮演的角色是「擴充題庫規模並維持品質」，而非系統的主體。教學設計的核心邏輯——認知歷程分層、教學策略對應、迷思診斷——均由教師專業知識定義，AI 負責將這套邏輯大規模複製至遷移題庫，並對現有資料進行品質稽核。</w:t>
+        <w:t>在這個系統裡，AI 做的事情不是設計課程或取代老師的判斷，而是處理一件非常耗時的事：大規模複製和稽核題目。什麼叫好的推論題、什麼叫符合學扶程度的詞彙難度——這些判準都是先由教師的專業知識定義好，再交給 AI 去執行的。</w:t>
       </w:r>
     </w:p>
     <w:p>
@@ -174,7 +174,7 @@
         <w:rPr>
           <w:sz w:val="24"/>
         </w:rPr>
-        <w:t>AI 應用分為三個層次。</w:t>
+        <w:t>具體分三件事。</w:t>
       </w:r>
     </w:p>
     <w:p>
@@ -183,7 +183,7 @@
           <w:b/>
           <w:sz w:val="24"/>
         </w:rPr>
-        <w:t>第一層：原始題庫資料健檢。 同時閱讀 195 道原始試題與教育部學習扶助國語教材（三至六年級，約 80 份 PDF），交叉比對教師人工標記的「認知歷程」標籤是否與教材對應段落的閱讀要求吻合。健檢結果發現 7 道題目的標籤有誤（例如標記為「提取訊息」但實際解題需要跨段落推論），並生成修正報告，經人工複核後自動寫回 Excel 試算表。同步修正三年級具體教學步驟格式（統一補句號、清除尾部多餘數字，共修正 41 筆）。以官方教材為對照基準，確保後續所有遷移題目是在「符合課綱定義的認知層次」上生成的。</w:t>
+        <w:t>第一件事是資料健檢。讓 AI 同時讀 195 道原始試題和大約 80 份教育部的學習扶助國語教材 PDF，比對人工標記的「認知歷程」標籤是否符合題目實際的解題要求。結果找出 7 道標籤有問題的題目，例如標記是「提取訊息」但解題其實需要跨段落推論。這些確認過後自動改回試算表裡。這一步的目的是讓後面的遷移題從一個正確的基礎上生成，而不是在錯誤的前提下複製放大。</w:t>
       </w:r>
       <w:r>
         <w:rPr>
@@ -197,7 +197,7 @@
           <w:b/>
           <w:sz w:val="24"/>
         </w:rPr>
-        <w:t>第二層：遷移題目生成。 閱讀每道原始試題的文章全文、認知歷程標籤與教學策略後，以文章為單位（1 篇原文配對 3 篇補充文本），自動生成對應的遷移文本與四選項題目，確保遷移題與原題在考點複雜度與誘答設計上具有同構性。本系統已完成生成全部 585 道遷移題目，覆蓋三至六年級全部 19 種教學策略。生成後並以兩輪清洗去除 PDF 掃描引入的頁碼標記（共修正 384 筆），確保遷移文本乾淨無雜訊。</w:t>
+        <w:t>第二件事是生成遷移題。以每篇文章為單位，讓 AI 讀原文的認知歷程標籤和教學策略，然後對照三篇補充文本各出一套題目，確保遷移題跟原題考的是同一件事、難度也相近。全部 585 道題目生成完之後，又跑了兩輪清洗，把 PDF 掃描帶進來的殘留頁碼（像「。3走」這種夾在正文裡的數字）清掉，共清了 384 筆。</w:t>
       </w:r>
       <w:r>
         <w:rPr>
@@ -211,7 +211,7 @@
           <w:b/>
           <w:sz w:val="24"/>
         </w:rPr>
-        <w:t>第三層：品質審查。以 Claude Sonnet 4.6 對每道遷移題進行四維度評分——考點同構（遷移題是否複製原題解題路徑）、誘答一致（錯誤選項是否對應相同類別的學生迷思）、策略適用（學生是否必須運用該策略才能作答）、基礎適配（詞彙難度是否符合學扶學生程度）——並給出「通過 / 需微調 / 建議重作」判定，同步輸出修正版題目與答案依據。整個審查過程全自動寫回試算表。審查完成後，以 Python 腳本分批修補含佔位符（OOO/XXX）的 272 道題目，補齊完整四選一選項。最終 585 題 100% 完成審查，其中 575 題通過（98.3%）、10 題標記需微調、0 題建議重作。</w:t>
+        <w:t>第三件事是品質審查。讓 Claude Sonnet 4.6 對每道遷移題從四個面向評分：考點是否跟原題同構、錯誤選項是否對應相同類型的學生迷思、這道題是否真的需要用到那個教學策略才能答對、詞彙難度是否適合學扶學生。評完之後輸出判定結果和修改建議，全程自動寫回試算表。過程中發現有 272 道題目的選項是佔位符（像「(A) OOO (B) XXX」），另外用 Python 腳本分批補齊。最後 585 題全數完審，575 題直接通過，10 題標記需微調。</w:t>
       </w:r>
       <w:r>
         <w:rPr>
@@ -224,7 +224,7 @@
         <w:rPr>
           <w:sz w:val="24"/>
         </w:rPr>
-        <w:t>三個層次合在一起，AI 承擔了整個題庫從「原料進場→健檢校正→遷移生成→規模擴充→多維品管→再次驗證」的完整 QC 流程，全部 585 道遷移題目已 100% 完成，可直接供教師使用。</w:t>
+        <w:t>三件事做下來，從原始資料健檢到題目生成再到品質驗收，這條流水線靠 AI 和自動化腳本跑完，老師只需要盯著真正需要人工判斷的部分就好。</w:t>
       </w:r>
     </w:p>
     <w:p>
@@ -245,43 +245,7 @@
           <w:b/>
           <w:sz w:val="24"/>
         </w:rPr>
-        <w:t>備課效率：</w:t>
-      </w:r>
-      <w:r>
-        <w:rPr>
-          <w:sz w:val="24"/>
-        </w:rPr>
-        <w:t>查詢一道策略案例從平均 15 分鐘縮短至 30 秒以內。</w:t>
-      </w:r>
-    </w:p>
-    <w:p>
-      <w:pPr>
-        <w:pStyle w:val="ListBullet"/>
-      </w:pPr>
-      <w:r>
-        <w:rPr>
-          <w:b/>
-          <w:sz w:val="24"/>
-        </w:rPr>
-        <w:t>題庫規模：</w:t>
-      </w:r>
-      <w:r>
-        <w:rPr>
-          <w:sz w:val="24"/>
-        </w:rPr>
-        <w:t>原始題目 195 道（108 至 114 年學習扶助歷年試題）加上 AI 遷移題目 585 道，共 780 道，覆蓋三至六年級、19 種教學策略、4 個認知歷程層次。</w:t>
-      </w:r>
-    </w:p>
-    <w:p>
-      <w:pPr>
-        <w:pStyle w:val="ListBullet"/>
-      </w:pPr>
-      <w:r>
-        <w:rPr>
-          <w:b/>
-          <w:sz w:val="24"/>
-        </w:rPr>
-        <w:t>文章全文補齊率：透過 AI 輔助 PDF 掃描（pdfplumber），57 篇文章全文完成入庫，完成率 83%（餘 12 篇為圖文／infographic 格式，無純文字可擷取，屬正常限制）。</w:t>
+        <w:t>備課時間：找到一道合適的策略案例從平均 15 分鐘縮短到 30 秒以內。</w:t>
       </w:r>
       <w:r>
         <w:rPr>
@@ -298,7 +262,7 @@
           <w:b/>
           <w:sz w:val="24"/>
         </w:rPr>
-        <w:t>AI 審查完成率與效率：585 道遷移題目 100% 完成 AI 多維度審查，通過率 98.3%（575 題通過、10 題需微調、0 題建議重作）；每題平均審查時間約 3 秒（含 API 呼叫），人工逐題審閱同等數量預計需 2 至 3 天。</w:t>
+        <w:t>題庫規模：195 道原始試題加上 585 道遷移題，共 780 道，三到六年級、19 種教學策略、4 個認知歷程層次都有涵蓋。</w:t>
       </w:r>
       <w:r>
         <w:rPr>
@@ -315,13 +279,46 @@
           <w:b/>
           <w:sz w:val="24"/>
         </w:rPr>
-        <w:t>可及性：</w:t>
+        <w:t>文章全文入庫率：57 篇文章全文完成入庫，完成率 83%。剩下的 12 篇是圖文或表格格式，沒有可以擷取的純文字段落，算是合理的例外。</w:t>
       </w:r>
       <w:r>
         <w:rPr>
           <w:sz w:val="24"/>
         </w:rPr>
-        <w:t>純瀏覽器操作，學校電腦、平板均可使用，無需安裝任何軟體或帳號申請。</w:t>
+      </w:r>
+    </w:p>
+    <w:p>
+      <w:pPr>
+        <w:pStyle w:val="ListBullet"/>
+      </w:pPr>
+      <w:r>
+        <w:rPr>
+          <w:b/>
+          <w:sz w:val="24"/>
+        </w:rPr>
+        <w:t>AI 審查效率：585 道題目 100% 完成審查，通過率 98.3%（575 題通過、10 題需微調）。每題平均審查時間約 3 秒，同樣數量若人工逐題審閱大概需要兩三天。</w:t>
+      </w:r>
+      <w:r>
+        <w:rPr>
+          <w:sz w:val="24"/>
+        </w:rPr>
+      </w:r>
+    </w:p>
+    <w:p>
+      <w:pPr>
+        <w:pStyle w:val="ListBullet"/>
+      </w:pPr>
+      <w:r>
+        <w:rPr>
+          <w:b/>
+          <w:sz w:val="24"/>
+        </w:rPr>
+        <w:t>可及性：純瀏覽器操作，學校電腦和平板都能用，不需要安裝任何軟體，也不需要申請帳號。</w:t>
+      </w:r>
+      <w:r>
+        <w:rPr>
+          <w:sz w:val="24"/>
+        </w:rPr>
       </w:r>
     </w:p>
     <w:p>
@@ -338,7 +335,7 @@
         <w:rPr>
           <w:sz w:val="24"/>
         </w:rPr>
-        <w:t>備課查詢與課堂簡報功能已完整上線，包含教材 PDF 直連、考古題試卷精準跳頁（GitHub Pages 托管，支援 #page=N&amp;view=FitH 參數），可直接分享網址給任何教師使用，無個人資料疑慮。學生自主練習系統（student_practice）亦已上線，採免登入設計，無帳號管理負擔。</w:t>
+        <w:t>備課查詢和課堂簡報的功能已經上線，直接把網址分給其他老師就能用，不會牽涉到個人資料的問題。學生自主練習的頁面也上了，不需要帳號，分享出去就能直接開。</w:t>
       </w:r>
     </w:p>
     <w:p>
@@ -346,7 +343,7 @@
         <w:rPr>
           <w:sz w:val="24"/>
         </w:rPr>
-        <w:t>測驗指派功能目前架構在單一 Google Sheets 下，若推廣至多校需重新設計班級隔離機制，適合先以班級或學校內部試行；免登入自主練習模式則不受此限制，可直接跨校分享使用。</w:t>
+        <w:t>比較需要注意的是老師指派測驗的功能，目前資料都存在同一個 Google Sheets 裡，要推廣到其他學校的話，需要另外處理班級資料隔離的問題，比較適合先在班級或學校內部試用。學生自主練習的部分就沒有這個問題，可以直接跨校分享。</w:t>
       </w:r>
     </w:p>
     <w:p>
@@ -354,7 +351,7 @@
         <w:rPr>
           <w:sz w:val="24"/>
         </w:rPr>
-        <w:t>建議推廣路徑：第一步分享教材查詢網址給同校或鄰近學校教師試用（含考古題精準跳頁體驗）；第二步發布完整版遷移題庫（585 道已 100% 完成審查，可立即使用）；第三步申請學習扶助資源中心掛載或投稿教學卓越獎，並開源 Python 題庫建置腳本供他校複製推廣。</w:t>
+        <w:t>推廣的話，我的想法是分三步：先把備課查詢的連結分給同校或附近學校的老師試試看；第二步開放完整的遷移題庫，585 道都已審完，可以直接用；第三步再考慮申請掛載到學習扶助資源中心，或是把建題用的 Python 腳本一起開放出去，讓其他學校也能用同樣的方式自己建。</w:t>
       </w:r>
     </w:p>
     <w:p>

</xml_diff>